<commit_message>
content: sync CV page and download file with the updated CV
Applies the changes from the revised source CV.

- Profile now reads "20+ years producing" rather than "directing and
  producing", matching the corrected document.
- Downloadable .docx patched in place so the Afghan Massacre credit reads
  co-produced, the profile matches the page, and a comma splice before
  "On secondment" is fixed.

The .docx text was edited inside the existing Word file rather than
regenerated from the .doc: converting with textutil broke all four
hyperlinks into literal "HYPERLINK ..." text and dropped 21 bold runs.
This way formatting and links are byte-identical to David's own export.

Co-Authored-By: Claude Opus 5 <noreply@anthropic.com>
</commit_message>
<xml_diff>
--- a/public/david_mcdougall_cv.docx
+++ b/public/david_mcdougall_cv.docx
@@ -202,7 +202,7 @@
           <w:sz w:val="19"/>
           <w:szCs w:val="19"/>
         </w:rPr>
-        <w:t xml:space="preserve">Broadcast executive producer and editorial leader with 20+ years directing and producing for BBC, Al Jazeera, Channel 4, Discovery, National Geographic and PBS, including nine years based in Doha, Qatar leading multiplatform production for regional and international broadcasters and brands. Series-directed </w:t>
+        <w:t xml:space="preserve">Broadcast executive producer and editorial leader with 20+ years producing for BBC, Al Jazeera, Channel 4, Discovery, National Geographic and PBS, including nine years based in Doha, Qatar leading multiplatform production for regional and international broadcasters and brands. Series-directed </w:t>
       </w:r>
       <w:r>
         <w:rPr>
@@ -218,7 +218,7 @@
           <w:sz w:val="19"/>
           <w:szCs w:val="19"/>
         </w:rPr>
-        <w:t>, a 15-part bilingual (Arabic/English) travel documentary for Al Jazeera reaching 50M+ viewers, On secondment as Senior Producer to Qatar Media Corporation, designed and launched TV programming and digital content for a new English-language broadcast channel — hands-on experience standing up a multiplatform show inside a national newsroom. Nine years as Executive Producer of The Wired Agency, building and mentoring multi-disciplinary international crews and producers across complex, cross-border productions for global broadcasters and premium brands. Brings this editorial and production leadership together with hands-on fluency in AI-native production pipelines, offering a rare ability to modernise multiplatform news workflows without compromising editorial rigour.</w:t>
+        <w:t>, a 15-part bilingual (Arabic/English) travel documentary for Al Jazeera reaching 50M+ viewers. On secondment as Senior Producer to Qatar Media Corporation, designed and launched TV programming and digital content for a new English-language broadcast channel — hands-on experience standing up a multiplatform show inside a national newsroom. Nine years as Executive Producer of The Wired Agency, building and mentoring multi-disciplinary international crews and producers across complex, cross-border productions for global broadcasters and premium brands. Brings this editorial and production leadership together with hands-on fluency in AI-native production pipelines, offering a rare ability to modernise multiplatform news workflows without compromising editorial rigour.</w:t>
       </w:r>
     </w:p>
     <w:p>
@@ -1362,7 +1362,7 @@
           <w:sz w:val="19"/>
           <w:szCs w:val="19"/>
         </w:rPr>
-        <w:t>Directed the multi-award-winning investigative documentary Afghan Massacre: The Convoy of Death, broadcast on Channel 5, CBC and ZDF.</w:t>
+        <w:t>Co-produced the multi-award-winning investigative documentary Afghan Massacre: The Convoy of Death, broadcast on Channel 5, CBC and ZDF.</w:t>
       </w:r>
     </w:p>
     <w:p>

</xml_diff>